<commit_message>
Finales PDF und Doku
</commit_message>
<xml_diff>
--- a/Doku/Fausch_Myroniuk_Kurmann_MMa25al_M287.docx
+++ b/Doku/Fausch_Myroniuk_Kurmann_MMa25al_M287.docx
@@ -28,27 +28,7 @@
           <w:color w:val="3D2817"/>
           <w:sz w:val="22"/>
         </w:rPr>
-        <w:t>MODUL M</w:t>
-      </w:r>
-      <w:proofErr w:type="gramStart"/>
-      <w:r>
-        <w:rPr>
-          <w:rFonts w:ascii="Aptos" w:hAnsi="Aptos"/>
-          <w:b/>
-          <w:color w:val="3D2817"/>
-          <w:sz w:val="22"/>
-        </w:rPr>
-        <w:t>287  ·</w:t>
-      </w:r>
-      <w:proofErr w:type="gramEnd"/>
-      <w:r>
-        <w:rPr>
-          <w:rFonts w:ascii="Aptos" w:hAnsi="Aptos"/>
-          <w:b/>
-          <w:color w:val="3D2817"/>
-          <w:sz w:val="22"/>
-        </w:rPr>
-        <w:t xml:space="preserve">  ABSCHLUSSARBEIT</w:t>
+        <w:t>MODUL M287  ·  ABSCHLUSSARBEIT</w:t>
       </w:r>
     </w:p>
     <w:p>
@@ -161,7 +141,7 @@
           </mc:Choice>
           <mc:Fallback>
             <w:pict>
-              <v:line w14:anchorId="18598702" id="Gerade Verbindung 1" o:spid="_x0000_s1026" style="position:absolute;z-index:251659264;visibility:visible;mso-wrap-style:square;mso-wrap-distance-left:9pt;mso-wrap-distance-top:0;mso-wrap-distance-right:9pt;mso-wrap-distance-bottom:0;mso-position-horizontal:absolute;mso-position-horizontal-relative:text;mso-position-vertical:absolute;mso-position-vertical-relative:text" from="-.15pt,41.95pt" to="353.4pt,41.95pt" o:gfxdata="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" strokecolor="#e97132 [3205]" strokeweight="1.5pt">
+              <v:line w14:anchorId="18598702" id="Gerade Verbindung 1" o:spid="_x0000_s1026" style="position:absolute;z-index:251659264;visibility:visible;mso-wrap-style:square;mso-wrap-distance-left:9pt;mso-wrap-distance-top:0;mso-wrap-distance-right:9pt;mso-wrap-distance-bottom:0;mso-position-horizontal:absolute;mso-position-horizontal-relative:text;mso-position-vertical:absolute;mso-position-vertical-relative:text" from="-.15pt,41.95pt" to="353.4pt,41.95pt" o:gfxdata="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" strokecolor="#e97132 [3205]" strokeweight="1.5pt">
                 <v:stroke joinstyle="miter"/>
               </v:line>
             </w:pict>
@@ -175,7 +155,25 @@
           <w:color w:val="3D2817"/>
           <w:sz w:val="40"/>
         </w:rPr>
-        <w:t>Eine kleine Webseite über ein kleines Wesen</w:t>
+        <w:t xml:space="preserve">Eine </w:t>
+      </w:r>
+      <w:r>
+        <w:rPr>
+          <w:rFonts w:ascii="Aptos Display" w:hAnsi="Aptos Display"/>
+          <w:i/>
+          <w:color w:val="3D2817"/>
+          <w:sz w:val="40"/>
+        </w:rPr>
+        <w:t>grosse</w:t>
+      </w:r>
+      <w:r>
+        <w:rPr>
+          <w:rFonts w:ascii="Aptos Display" w:hAnsi="Aptos Display"/>
+          <w:i/>
+          <w:color w:val="3D2817"/>
+          <w:sz w:val="40"/>
+        </w:rPr>
+        <w:t xml:space="preserve"> Webseite über ein kleines Wesen</w:t>
       </w:r>
     </w:p>
     <w:p>
@@ -225,58 +223,7 @@
           <w:color w:val="3D2817"/>
           <w:sz w:val="28"/>
         </w:rPr>
-        <w:t xml:space="preserve">Timo </w:t>
-      </w:r>
-      <w:proofErr w:type="spellStart"/>
-      <w:proofErr w:type="gramStart"/>
-      <w:r>
-        <w:rPr>
-          <w:rFonts w:ascii="Aptos" w:hAnsi="Aptos"/>
-          <w:b/>
-          <w:color w:val="3D2817"/>
-          <w:sz w:val="28"/>
-        </w:rPr>
-        <w:t>Fausch</w:t>
-      </w:r>
-      <w:proofErr w:type="spellEnd"/>
-      <w:r>
-        <w:rPr>
-          <w:rFonts w:ascii="Aptos" w:hAnsi="Aptos"/>
-          <w:b/>
-          <w:color w:val="3D2817"/>
-          <w:sz w:val="28"/>
-        </w:rPr>
-        <w:t xml:space="preserve">  ·</w:t>
-      </w:r>
-      <w:proofErr w:type="gramEnd"/>
-      <w:r>
-        <w:rPr>
-          <w:rFonts w:ascii="Aptos" w:hAnsi="Aptos"/>
-          <w:b/>
-          <w:color w:val="3D2817"/>
-          <w:sz w:val="28"/>
-        </w:rPr>
-        <w:t xml:space="preserve">  Myroslava </w:t>
-      </w:r>
-      <w:proofErr w:type="gramStart"/>
-      <w:r>
-        <w:rPr>
-          <w:rFonts w:ascii="Aptos" w:hAnsi="Aptos"/>
-          <w:b/>
-          <w:color w:val="3D2817"/>
-          <w:sz w:val="28"/>
-        </w:rPr>
-        <w:t>Myroniuk  ·</w:t>
-      </w:r>
-      <w:proofErr w:type="gramEnd"/>
-      <w:r>
-        <w:rPr>
-          <w:rFonts w:ascii="Aptos" w:hAnsi="Aptos"/>
-          <w:b/>
-          <w:color w:val="3D2817"/>
-          <w:sz w:val="28"/>
-        </w:rPr>
-        <w:t xml:space="preserve">  Fabio Kurmann</w:t>
+        <w:t>Timo Fausch Myroslava Myroniuk Fabio Kurmann</w:t>
       </w:r>
     </w:p>
     <w:p>
@@ -417,7 +364,7 @@
           <w:color w:val="B85C38"/>
         </w:rPr>
       </w:pPr>
-      <w:bookmarkStart w:id="0" w:name="_Toc229497086"/>
+      <w:bookmarkStart w:id="0" w:name="_Toc230703500"/>
       <w:r>
         <w:rPr>
           <w:color w:val="B85C38"/>
@@ -477,7 +424,7 @@
             <w:rPr>
               <w:rFonts w:eastAsiaTheme="minorEastAsia"/>
               <w:noProof/>
-              <w:lang w:eastAsia="de-DE"/>
+              <w:lang w:eastAsia="de-CH"/>
             </w:rPr>
           </w:pPr>
           <w:r>
@@ -489,7 +436,7 @@
           <w:r>
             <w:fldChar w:fldCharType="separate"/>
           </w:r>
-          <w:hyperlink w:anchor="_Toc229497086" w:history="1">
+          <w:hyperlink w:anchor="_Toc230703500" w:history="1">
             <w:r>
               <w:rPr>
                 <w:rStyle w:val="Hyperlink"/>
@@ -501,7 +448,7 @@
               <w:rPr>
                 <w:rFonts w:eastAsiaTheme="minorEastAsia"/>
                 <w:noProof/>
-                <w:lang w:eastAsia="de-DE"/>
+                <w:lang w:eastAsia="de-CH"/>
               </w:rPr>
               <w:tab/>
             </w:r>
@@ -531,7 +478,7 @@
                 <w:noProof/>
                 <w:webHidden/>
               </w:rPr>
-              <w:instrText xml:space="preserve"> PAGEREF _Toc229497086 \h </w:instrText>
+              <w:instrText xml:space="preserve"> PAGEREF _Toc230703500 \h </w:instrText>
             </w:r>
             <w:r>
               <w:rPr>
@@ -572,16 +519,14 @@
             <w:rPr>
               <w:rFonts w:eastAsiaTheme="minorEastAsia"/>
               <w:noProof/>
-              <w:color w:val="3D2817"/>
-              <w:lang w:eastAsia="de-DE"/>
+              <w:lang w:eastAsia="de-CH"/>
             </w:rPr>
           </w:pPr>
-          <w:hyperlink w:anchor="_Toc229497087" w:history="1">
+          <w:hyperlink w:anchor="_Toc230703501" w:history="1">
             <w:r>
               <w:rPr>
                 <w:rStyle w:val="Hyperlink"/>
                 <w:noProof/>
-                <w:color w:val="3D2817"/>
               </w:rPr>
               <w:t>2.</w:t>
             </w:r>
@@ -589,8 +534,7 @@
               <w:rPr>
                 <w:rFonts w:eastAsiaTheme="minorEastAsia"/>
                 <w:noProof/>
-                <w:color w:val="3D2817"/>
-                <w:lang w:eastAsia="de-DE"/>
+                <w:lang w:eastAsia="de-CH"/>
               </w:rPr>
               <w:tab/>
             </w:r>
@@ -598,7 +542,6 @@
               <w:rPr>
                 <w:rStyle w:val="Hyperlink"/>
                 <w:noProof/>
-                <w:color w:val="3D2817"/>
               </w:rPr>
               <w:t>Umsetzung</w:t>
             </w:r>
@@ -606,7 +549,6 @@
               <w:rPr>
                 <w:noProof/>
                 <w:webHidden/>
-                <w:color w:val="3D2817"/>
               </w:rPr>
               <w:tab/>
             </w:r>
@@ -614,7 +556,6 @@
               <w:rPr>
                 <w:noProof/>
                 <w:webHidden/>
-                <w:color w:val="3D2817"/>
               </w:rPr>
               <w:fldChar w:fldCharType="begin"/>
             </w:r>
@@ -622,22 +563,19 @@
               <w:rPr>
                 <w:noProof/>
                 <w:webHidden/>
-                <w:color w:val="3D2817"/>
-              </w:rPr>
-              <w:instrText xml:space="preserve"> PAGEREF _Toc229497087 \h </w:instrText>
+              </w:rPr>
+              <w:instrText xml:space="preserve"> PAGEREF _Toc230703501 \h </w:instrText>
             </w:r>
             <w:r>
               <w:rPr>
                 <w:noProof/>
                 <w:webHidden/>
-                <w:color w:val="3D2817"/>
               </w:rPr>
             </w:r>
             <w:r>
               <w:rPr>
                 <w:noProof/>
                 <w:webHidden/>
-                <w:color w:val="3D2817"/>
               </w:rPr>
               <w:fldChar w:fldCharType="separate"/>
             </w:r>
@@ -645,7 +583,6 @@
               <w:rPr>
                 <w:noProof/>
                 <w:webHidden/>
-                <w:color w:val="3D2817"/>
               </w:rPr>
               <w:t>3</w:t>
             </w:r>
@@ -653,7 +590,6 @@
               <w:rPr>
                 <w:noProof/>
                 <w:webHidden/>
-                <w:color w:val="3D2817"/>
               </w:rPr>
               <w:fldChar w:fldCharType="end"/>
             </w:r>
@@ -666,17 +602,17 @@
               <w:tab w:val="right" w:leader="dot" w:pos="9061"/>
             </w:tabs>
             <w:rPr>
+              <w:rFonts w:eastAsiaTheme="minorEastAsia"/>
               <w:noProof/>
-              <w:color w:val="3D2817"/>
+              <w:lang w:eastAsia="de-CH"/>
             </w:rPr>
           </w:pPr>
-          <w:hyperlink w:anchor="_Toc229497088" w:history="1">
+          <w:hyperlink w:anchor="_Toc230703502" w:history="1">
             <w:r>
               <w:rPr>
                 <w:rStyle w:val="Hyperlink"/>
                 <w:rFonts w:ascii="Aptos Display" w:hAnsi="Aptos Display"/>
                 <w:noProof/>
-                <w:color w:val="3D2817"/>
               </w:rPr>
               <w:t>Sollten Sie die Webseite zur Weiterentwicklung übergeben, was würden Sie einer anderen Person noch mitteilen?</w:t>
             </w:r>
@@ -684,7 +620,6 @@
               <w:rPr>
                 <w:noProof/>
                 <w:webHidden/>
-                <w:color w:val="3D2817"/>
               </w:rPr>
               <w:tab/>
             </w:r>
@@ -692,7 +627,6 @@
               <w:rPr>
                 <w:noProof/>
                 <w:webHidden/>
-                <w:color w:val="3D2817"/>
               </w:rPr>
               <w:fldChar w:fldCharType="begin"/>
             </w:r>
@@ -700,22 +634,19 @@
               <w:rPr>
                 <w:noProof/>
                 <w:webHidden/>
-                <w:color w:val="3D2817"/>
-              </w:rPr>
-              <w:instrText xml:space="preserve"> PAGEREF _Toc229497088 \h </w:instrText>
+              </w:rPr>
+              <w:instrText xml:space="preserve"> PAGEREF _Toc230703502 \h </w:instrText>
             </w:r>
             <w:r>
               <w:rPr>
                 <w:noProof/>
                 <w:webHidden/>
-                <w:color w:val="3D2817"/>
               </w:rPr>
             </w:r>
             <w:r>
               <w:rPr>
                 <w:noProof/>
                 <w:webHidden/>
-                <w:color w:val="3D2817"/>
               </w:rPr>
               <w:fldChar w:fldCharType="separate"/>
             </w:r>
@@ -723,15 +654,13 @@
               <w:rPr>
                 <w:noProof/>
                 <w:webHidden/>
-                <w:color w:val="3D2817"/>
-              </w:rPr>
-              <w:t>4</w:t>
+              </w:rPr>
+              <w:t>3</w:t>
             </w:r>
             <w:r>
               <w:rPr>
                 <w:noProof/>
                 <w:webHidden/>
-                <w:color w:val="3D2817"/>
               </w:rPr>
               <w:fldChar w:fldCharType="end"/>
             </w:r>
@@ -744,17 +673,17 @@
               <w:tab w:val="right" w:leader="dot" w:pos="9061"/>
             </w:tabs>
             <w:rPr>
+              <w:rFonts w:eastAsiaTheme="minorEastAsia"/>
               <w:noProof/>
-              <w:color w:val="3D2817"/>
+              <w:lang w:eastAsia="de-CH"/>
             </w:rPr>
           </w:pPr>
-          <w:hyperlink w:anchor="_Toc229497089" w:history="1">
+          <w:hyperlink w:anchor="_Toc230703503" w:history="1">
             <w:r>
               <w:rPr>
                 <w:rStyle w:val="Hyperlink"/>
                 <w:rFonts w:ascii="Aptos Display" w:hAnsi="Aptos Display"/>
                 <w:noProof/>
-                <w:color w:val="3D2817"/>
               </w:rPr>
               <w:t>Wie würden Sie die Webseite noch ausbauen, wenn Sie mehr Zeit hätten?</w:t>
             </w:r>
@@ -762,7 +691,6 @@
               <w:rPr>
                 <w:noProof/>
                 <w:webHidden/>
-                <w:color w:val="3D2817"/>
               </w:rPr>
               <w:tab/>
             </w:r>
@@ -770,7 +698,6 @@
               <w:rPr>
                 <w:noProof/>
                 <w:webHidden/>
-                <w:color w:val="3D2817"/>
               </w:rPr>
               <w:fldChar w:fldCharType="begin"/>
             </w:r>
@@ -778,22 +705,19 @@
               <w:rPr>
                 <w:noProof/>
                 <w:webHidden/>
-                <w:color w:val="3D2817"/>
-              </w:rPr>
-              <w:instrText xml:space="preserve"> PAGEREF _Toc229497089 \h </w:instrText>
+              </w:rPr>
+              <w:instrText xml:space="preserve"> PAGEREF _Toc230703503 \h </w:instrText>
             </w:r>
             <w:r>
               <w:rPr>
                 <w:noProof/>
                 <w:webHidden/>
-                <w:color w:val="3D2817"/>
               </w:rPr>
             </w:r>
             <w:r>
               <w:rPr>
                 <w:noProof/>
                 <w:webHidden/>
-                <w:color w:val="3D2817"/>
               </w:rPr>
               <w:fldChar w:fldCharType="separate"/>
             </w:r>
@@ -801,15 +725,13 @@
               <w:rPr>
                 <w:noProof/>
                 <w:webHidden/>
-                <w:color w:val="3D2817"/>
-              </w:rPr>
-              <w:t>5</w:t>
+              </w:rPr>
+              <w:t>4</w:t>
             </w:r>
             <w:r>
               <w:rPr>
                 <w:noProof/>
                 <w:webHidden/>
-                <w:color w:val="3D2817"/>
               </w:rPr>
               <w:fldChar w:fldCharType="end"/>
             </w:r>
@@ -825,16 +747,14 @@
             <w:rPr>
               <w:rFonts w:eastAsiaTheme="minorEastAsia"/>
               <w:noProof/>
-              <w:color w:val="3D2817"/>
-              <w:lang w:eastAsia="de-DE"/>
+              <w:lang w:eastAsia="de-CH"/>
             </w:rPr>
           </w:pPr>
-          <w:hyperlink w:anchor="_Toc229497090" w:history="1">
+          <w:hyperlink w:anchor="_Toc230703504" w:history="1">
             <w:r>
               <w:rPr>
                 <w:rStyle w:val="Hyperlink"/>
                 <w:noProof/>
-                <w:color w:val="3D2817"/>
               </w:rPr>
               <w:t>3.</w:t>
             </w:r>
@@ -842,8 +762,7 @@
               <w:rPr>
                 <w:rFonts w:eastAsiaTheme="minorEastAsia"/>
                 <w:noProof/>
-                <w:color w:val="3D2817"/>
-                <w:lang w:eastAsia="de-DE"/>
+                <w:lang w:eastAsia="de-CH"/>
               </w:rPr>
               <w:tab/>
             </w:r>
@@ -851,7 +770,6 @@
               <w:rPr>
                 <w:rStyle w:val="Hyperlink"/>
                 <w:noProof/>
-                <w:color w:val="3D2817"/>
               </w:rPr>
               <w:t>Lessons Learned</w:t>
             </w:r>
@@ -859,7 +777,6 @@
               <w:rPr>
                 <w:noProof/>
                 <w:webHidden/>
-                <w:color w:val="3D2817"/>
               </w:rPr>
               <w:tab/>
             </w:r>
@@ -867,7 +784,6 @@
               <w:rPr>
                 <w:noProof/>
                 <w:webHidden/>
-                <w:color w:val="3D2817"/>
               </w:rPr>
               <w:fldChar w:fldCharType="begin"/>
             </w:r>
@@ -875,22 +791,19 @@
               <w:rPr>
                 <w:noProof/>
                 <w:webHidden/>
-                <w:color w:val="3D2817"/>
-              </w:rPr>
-              <w:instrText xml:space="preserve"> PAGEREF _Toc229497090 \h </w:instrText>
+              </w:rPr>
+              <w:instrText xml:space="preserve"> PAGEREF _Toc230703504 \h </w:instrText>
             </w:r>
             <w:r>
               <w:rPr>
                 <w:noProof/>
                 <w:webHidden/>
-                <w:color w:val="3D2817"/>
               </w:rPr>
             </w:r>
             <w:r>
               <w:rPr>
                 <w:noProof/>
                 <w:webHidden/>
-                <w:color w:val="3D2817"/>
               </w:rPr>
               <w:fldChar w:fldCharType="separate"/>
             </w:r>
@@ -898,15 +811,13 @@
               <w:rPr>
                 <w:noProof/>
                 <w:webHidden/>
-                <w:color w:val="3D2817"/>
-              </w:rPr>
-              <w:t>6</w:t>
+              </w:rPr>
+              <w:t>5</w:t>
             </w:r>
             <w:r>
               <w:rPr>
                 <w:noProof/>
                 <w:webHidden/>
-                <w:color w:val="3D2817"/>
               </w:rPr>
               <w:fldChar w:fldCharType="end"/>
             </w:r>
@@ -922,16 +833,14 @@
             <w:rPr>
               <w:rFonts w:eastAsiaTheme="minorEastAsia"/>
               <w:noProof/>
-              <w:color w:val="3D2817"/>
-              <w:lang w:eastAsia="de-DE"/>
+              <w:lang w:eastAsia="de-CH"/>
             </w:rPr>
           </w:pPr>
-          <w:hyperlink w:anchor="_Toc229497091" w:history="1">
+          <w:hyperlink w:anchor="_Toc230703505" w:history="1">
             <w:r>
               <w:rPr>
                 <w:rStyle w:val="Hyperlink"/>
                 <w:noProof/>
-                <w:color w:val="3D2817"/>
               </w:rPr>
               <w:t>4.</w:t>
             </w:r>
@@ -939,8 +848,7 @@
               <w:rPr>
                 <w:rFonts w:eastAsiaTheme="minorEastAsia"/>
                 <w:noProof/>
-                <w:color w:val="3D2817"/>
-                <w:lang w:eastAsia="de-DE"/>
+                <w:lang w:eastAsia="de-CH"/>
               </w:rPr>
               <w:tab/>
             </w:r>
@@ -948,7 +856,6 @@
               <w:rPr>
                 <w:rStyle w:val="Hyperlink"/>
                 <w:noProof/>
-                <w:color w:val="3D2817"/>
               </w:rPr>
               <w:t>Selbständigkeitserklärung</w:t>
             </w:r>
@@ -956,7 +863,6 @@
               <w:rPr>
                 <w:noProof/>
                 <w:webHidden/>
-                <w:color w:val="3D2817"/>
               </w:rPr>
               <w:tab/>
             </w:r>
@@ -964,7 +870,6 @@
               <w:rPr>
                 <w:noProof/>
                 <w:webHidden/>
-                <w:color w:val="3D2817"/>
               </w:rPr>
               <w:fldChar w:fldCharType="begin"/>
             </w:r>
@@ -972,22 +877,19 @@
               <w:rPr>
                 <w:noProof/>
                 <w:webHidden/>
-                <w:color w:val="3D2817"/>
-              </w:rPr>
-              <w:instrText xml:space="preserve"> PAGEREF _Toc229497091 \h </w:instrText>
+              </w:rPr>
+              <w:instrText xml:space="preserve"> PAGEREF _Toc230703505 \h </w:instrText>
             </w:r>
             <w:r>
               <w:rPr>
                 <w:noProof/>
                 <w:webHidden/>
-                <w:color w:val="3D2817"/>
               </w:rPr>
             </w:r>
             <w:r>
               <w:rPr>
                 <w:noProof/>
                 <w:webHidden/>
-                <w:color w:val="3D2817"/>
               </w:rPr>
               <w:fldChar w:fldCharType="separate"/>
             </w:r>
@@ -995,15 +897,13 @@
               <w:rPr>
                 <w:noProof/>
                 <w:webHidden/>
-                <w:color w:val="3D2817"/>
-              </w:rPr>
-              <w:t>7</w:t>
+              </w:rPr>
+              <w:t>6</w:t>
             </w:r>
             <w:r>
               <w:rPr>
                 <w:noProof/>
                 <w:webHidden/>
-                <w:color w:val="3D2817"/>
               </w:rPr>
               <w:fldChar w:fldCharType="end"/>
             </w:r>
@@ -1049,7 +949,7 @@
           <w:color w:val="B85C38"/>
         </w:rPr>
       </w:pPr>
-      <w:bookmarkStart w:id="1" w:name="_Toc229497087"/>
+      <w:bookmarkStart w:id="1" w:name="_Toc230703501"/>
       <w:r>
         <w:rPr>
           <w:color w:val="B85C38"/>
@@ -1237,19 +1137,11 @@
                 <w:color w:val="3D2817"/>
               </w:rPr>
             </w:pPr>
-            <w:proofErr w:type="spellStart"/>
-            <w:r>
-              <w:rPr>
-                <w:color w:val="3D2817"/>
-              </w:rPr>
-              <w:t>css</w:t>
-            </w:r>
-            <w:proofErr w:type="spellEnd"/>
-            <w:r>
-              <w:rPr>
-                <w:color w:val="3D2817"/>
-              </w:rPr>
-              <w:t>/style.css eingebunden in index.html Z. 7</w:t>
+            <w:r>
+              <w:rPr>
+                <w:color w:val="3D2817"/>
+              </w:rPr>
+              <w:t>css/style.css eingebunden in index.html Z. 7</w:t>
             </w:r>
             <w:r>
               <w:rPr>
@@ -1421,25 +1313,7 @@
                 <w:iCs/>
                 <w:color w:val="3D2817"/>
               </w:rPr>
-              <w:t xml:space="preserve">4 Spalten </w:t>
-            </w:r>
-            <w:proofErr w:type="spellStart"/>
-            <w:r>
-              <w:rPr>
-                <w:i/>
-                <w:iCs/>
-                <w:color w:val="3D2817"/>
-              </w:rPr>
-              <w:t>css</w:t>
-            </w:r>
-            <w:proofErr w:type="spellEnd"/>
-            <w:r>
-              <w:rPr>
-                <w:i/>
-                <w:iCs/>
-                <w:color w:val="3D2817"/>
-              </w:rPr>
-              <w:t>/style.css</w:t>
+              <w:t>4 Spalten css/style.css</w:t>
             </w:r>
           </w:p>
           <w:p>
@@ -1453,7 +1327,27 @@
               <w:rPr>
                 <w:color w:val="3D2817"/>
               </w:rPr>
-              <w:t>Zeilen: ca. 976–980</w:t>
+              <w:t>Zeilen: 976–980</w:t>
+            </w:r>
+          </w:p>
+          <w:p>
+            <w:pPr>
+              <w:cnfStyle w:val="000000000000" w:firstRow="0" w:lastRow="0" w:firstColumn="0" w:lastColumn="0" w:oddVBand="0" w:evenVBand="0" w:oddHBand="0" w:evenHBand="0" w:firstRowFirstColumn="0" w:firstRowLastColumn="0" w:lastRowFirstColumn="0" w:lastRowLastColumn="0"/>
+              <w:rPr>
+                <w:color w:val="3D2817"/>
+              </w:rPr>
+            </w:pPr>
+            <w:r>
+              <w:rPr>
+                <w:color w:val="3D2817"/>
+              </w:rPr>
+              <w:t>Index: 65-73</w:t>
+            </w:r>
+            <w:r>
+              <w:rPr>
+                <w:color w:val="3D2817"/>
+              </w:rPr>
+              <w:t>/Galerie 28-37</w:t>
             </w:r>
           </w:p>
         </w:tc>
@@ -1472,27 +1366,15 @@
             <w:pPr>
               <w:rPr>
                 <w:color w:val="3D2817"/>
+                <w:lang w:val="en-US"/>
               </w:rPr>
             </w:pPr>
             <w:r>
               <w:rPr>
                 <w:color w:val="3D2817"/>
-              </w:rPr>
-              <w:t xml:space="preserve">Elemente: Card, Modal, </w:t>
-            </w:r>
-            <w:proofErr w:type="spellStart"/>
-            <w:r>
-              <w:rPr>
-                <w:color w:val="3D2817"/>
-              </w:rPr>
-              <w:t>Accordion</w:t>
-            </w:r>
-            <w:proofErr w:type="spellEnd"/>
-            <w:r>
-              <w:rPr>
-                <w:color w:val="3D2817"/>
-              </w:rPr>
-              <w:t>, Bild mit Text, Animation</w:t>
+                <w:lang w:val="en-US"/>
+              </w:rPr>
+              <w:t>Elemente: Card, Modal, Accordion, Bild mit Text, Animation</w:t>
             </w:r>
           </w:p>
         </w:tc>
@@ -1558,81 +1440,50 @@
               <w:cnfStyle w:val="000000100000" w:firstRow="0" w:lastRow="0" w:firstColumn="0" w:lastColumn="0" w:oddVBand="0" w:evenVBand="0" w:oddHBand="1" w:evenHBand="0" w:firstRowFirstColumn="0" w:firstRowLastColumn="0" w:lastRowFirstColumn="0" w:lastRowLastColumn="0"/>
               <w:rPr>
                 <w:color w:val="3D2817"/>
+                <w:lang w:val="en-US"/>
               </w:rPr>
             </w:pPr>
-            <w:proofErr w:type="spellStart"/>
-            <w:r>
-              <w:rPr>
-                <w:color w:val="3D2817"/>
-              </w:rPr>
-              <w:t>Accordion</w:t>
-            </w:r>
-            <w:proofErr w:type="spellEnd"/>
-            <w:r>
-              <w:rPr>
-                <w:color w:val="3D2817"/>
-              </w:rPr>
-              <w:t>: index.html Z. 6</w:t>
-            </w:r>
-            <w:r>
-              <w:rPr>
-                <w:color w:val="3D2817"/>
+            <w:r>
+              <w:rPr>
+                <w:color w:val="3D2817"/>
+                <w:lang w:val="en-US"/>
+              </w:rPr>
+              <w:t>Accordion: index.html Z. 6</w:t>
+            </w:r>
+            <w:r>
+              <w:rPr>
+                <w:color w:val="3D2817"/>
+                <w:lang w:val="en-US"/>
               </w:rPr>
               <w:t>5</w:t>
             </w:r>
             <w:r>
               <w:rPr>
                 <w:color w:val="3D2817"/>
+                <w:lang w:val="en-US"/>
               </w:rPr>
               <w:t>–7</w:t>
             </w:r>
             <w:r>
               <w:rPr>
                 <w:color w:val="3D2817"/>
+                <w:lang w:val="en-US"/>
               </w:rPr>
               <w:t>4</w:t>
             </w:r>
             <w:r>
               <w:rPr>
                 <w:color w:val="3D2817"/>
+                <w:lang w:val="en-US"/>
               </w:rPr>
               <w:t xml:space="preserve">. </w:t>
             </w:r>
             <w:r>
               <w:rPr>
                 <w:color w:val="3D2817"/>
-              </w:rPr>
-              <w:t>style</w:t>
-            </w:r>
-            <w:r>
-              <w:rPr>
-                <w:color w:val="3D2817"/>
-              </w:rPr>
-              <w:t>.</w:t>
-            </w:r>
-            <w:r>
-              <w:rPr>
-                <w:color w:val="3D2817"/>
-              </w:rPr>
-              <w:t>css</w:t>
-            </w:r>
-            <w:r>
-              <w:rPr>
-                <w:color w:val="3D2817"/>
-              </w:rPr>
-              <w:t xml:space="preserve"> Z. </w:t>
-            </w:r>
-            <w:r>
-              <w:rPr>
-                <w:color w:val="3D2817"/>
-              </w:rPr>
-              <w:t>1042</w:t>
-            </w:r>
-            <w:r>
-              <w:rPr>
-                <w:color w:val="3D2817"/>
-              </w:rPr>
-              <w:t>.</w:t>
+                <w:lang w:val="en-US"/>
+              </w:rPr>
+              <w:t>style.css Z. 1042.</w:t>
             </w:r>
           </w:p>
           <w:p>
@@ -1712,91 +1563,7 @@
               <w:rPr>
                 <w:color w:val="3D2817"/>
               </w:rPr>
-              <w:t>Multimedia: &lt;</w:t>
-            </w:r>
-            <w:proofErr w:type="spellStart"/>
-            <w:r>
-              <w:rPr>
-                <w:color w:val="3D2817"/>
-              </w:rPr>
-              <w:t>video</w:t>
-            </w:r>
-            <w:proofErr w:type="spellEnd"/>
-            <w:r>
-              <w:rPr>
-                <w:color w:val="3D2817"/>
-              </w:rPr>
-              <w:t xml:space="preserve">&gt; mit </w:t>
-            </w:r>
-            <w:proofErr w:type="spellStart"/>
-            <w:r>
-              <w:rPr>
-                <w:color w:val="3D2817"/>
-              </w:rPr>
-              <w:t>preload</w:t>
-            </w:r>
-            <w:proofErr w:type="spellEnd"/>
-            <w:r>
-              <w:rPr>
-                <w:color w:val="3D2817"/>
-              </w:rPr>
-              <w:t>="</w:t>
-            </w:r>
-            <w:proofErr w:type="spellStart"/>
-            <w:r>
-              <w:rPr>
-                <w:color w:val="3D2817"/>
-              </w:rPr>
-              <w:t>none</w:t>
-            </w:r>
-            <w:proofErr w:type="spellEnd"/>
-            <w:r>
-              <w:rPr>
-                <w:color w:val="3D2817"/>
-              </w:rPr>
-              <w:t>"; &lt;</w:t>
-            </w:r>
-            <w:proofErr w:type="spellStart"/>
-            <w:r>
-              <w:rPr>
-                <w:color w:val="3D2817"/>
-              </w:rPr>
-              <w:t>audio</w:t>
-            </w:r>
-            <w:proofErr w:type="spellEnd"/>
-            <w:r>
-              <w:rPr>
-                <w:color w:val="3D2817"/>
-              </w:rPr>
-              <w:t xml:space="preserve">&gt; steuerbar mit </w:t>
-            </w:r>
-            <w:proofErr w:type="spellStart"/>
-            <w:r>
-              <w:rPr>
-                <w:color w:val="3D2817"/>
-              </w:rPr>
-              <w:t>preload</w:t>
-            </w:r>
-            <w:proofErr w:type="spellEnd"/>
-            <w:r>
-              <w:rPr>
-                <w:color w:val="3D2817"/>
-              </w:rPr>
-              <w:t>="</w:t>
-            </w:r>
-            <w:proofErr w:type="spellStart"/>
-            <w:r>
-              <w:rPr>
-                <w:color w:val="3D2817"/>
-              </w:rPr>
-              <w:t>none</w:t>
-            </w:r>
-            <w:proofErr w:type="spellEnd"/>
-            <w:r>
-              <w:rPr>
-                <w:color w:val="3D2817"/>
-              </w:rPr>
-              <w:t>"</w:t>
+              <w:t>Multimedia: &lt;video&gt; mit preload="none"; &lt;audio&gt; steuerbar mit preload="none"</w:t>
             </w:r>
           </w:p>
         </w:tc>
@@ -1906,21 +1673,7 @@
               <w:rPr>
                 <w:color w:val="3D2817"/>
               </w:rPr>
-              <w:t xml:space="preserve">Struktur: </w:t>
-            </w:r>
-            <w:proofErr w:type="spellStart"/>
-            <w:r>
-              <w:rPr>
-                <w:color w:val="3D2817"/>
-              </w:rPr>
-              <w:t>favicon</w:t>
-            </w:r>
-            <w:proofErr w:type="spellEnd"/>
-            <w:r>
-              <w:rPr>
-                <w:color w:val="3D2817"/>
-              </w:rPr>
-              <w:t>, title, Ordnerstruktur, semantisches HTML, Kommentare</w:t>
+              <w:t>Struktur: favicon, title, Ordnerstruktur, semantisches HTML, Kommentare</w:t>
             </w:r>
           </w:p>
         </w:tc>
@@ -1939,49 +1692,42 @@
             <w:r>
               <w:rPr>
                 <w:color w:val="3D2817"/>
-                <w:lang w:val="fr-CH"/>
+                <w:lang w:val="en-US"/>
               </w:rPr>
               <w:t>index.html Z. 4</w:t>
             </w:r>
             <w:r>
               <w:rPr>
                 <w:color w:val="3D2817"/>
-                <w:lang w:val="fr-CH"/>
+                <w:lang w:val="en-US"/>
               </w:rPr>
               <w:t>.</w:t>
             </w:r>
             <w:r>
               <w:rPr>
                 <w:color w:val="3D2817"/>
-                <w:lang w:val="fr-CH"/>
+                <w:lang w:val="en-US"/>
               </w:rPr>
               <w:br/>
             </w:r>
             <w:r>
               <w:rPr>
                 <w:color w:val="3D2817"/>
-                <w:lang w:val="fr-CH"/>
+                <w:lang w:val="en-US"/>
               </w:rPr>
               <w:t xml:space="preserve">facts.html Z. </w:t>
             </w:r>
             <w:r>
               <w:rPr>
                 <w:color w:val="3D2817"/>
-                <w:lang w:val="fr-CH"/>
-              </w:rPr>
-              <w:t>7</w:t>
-            </w:r>
-            <w:r>
-              <w:rPr>
-                <w:color w:val="3D2817"/>
-                <w:lang w:val="fr-CH"/>
-              </w:rPr>
-              <w:t>.</w:t>
-            </w:r>
-            <w:r>
-              <w:rPr>
-                <w:color w:val="3D2817"/>
-                <w:lang w:val="fr-CH"/>
+                <w:lang w:val="en-US"/>
+              </w:rPr>
+              <w:t>7.</w:t>
+            </w:r>
+            <w:r>
+              <w:rPr>
+                <w:color w:val="3D2817"/>
+                <w:lang w:val="en-US"/>
               </w:rPr>
               <w:br/>
             </w:r>
@@ -2007,7 +1753,13 @@
               <w:rPr>
                 <w:color w:val="3D2817"/>
               </w:rPr>
-              <w:t xml:space="preserve">gallerie.html Z. </w:t>
+              <w:t>G</w:t>
+            </w:r>
+            <w:r>
+              <w:rPr>
+                <w:color w:val="3D2817"/>
+              </w:rPr>
+              <w:t xml:space="preserve">allerie.html Z. </w:t>
             </w:r>
             <w:r>
               <w:rPr>
@@ -2031,105 +1783,7 @@
               <w:rPr>
                 <w:color w:val="3D2817"/>
               </w:rPr>
-              <w:t xml:space="preserve">Ordnerstruktur: </w:t>
-            </w:r>
-            <w:proofErr w:type="spellStart"/>
-            <w:r>
-              <w:rPr>
-                <w:color w:val="3D2817"/>
-              </w:rPr>
-              <w:t>css</w:t>
-            </w:r>
-            <w:proofErr w:type="spellEnd"/>
-            <w:r>
-              <w:rPr>
-                <w:color w:val="3D2817"/>
-              </w:rPr>
-              <w:t xml:space="preserve">/, </w:t>
-            </w:r>
-            <w:proofErr w:type="spellStart"/>
-            <w:r>
-              <w:rPr>
-                <w:color w:val="3D2817"/>
-              </w:rPr>
-              <w:t>html</w:t>
-            </w:r>
-            <w:proofErr w:type="spellEnd"/>
-            <w:r>
-              <w:rPr>
-                <w:color w:val="3D2817"/>
-              </w:rPr>
-              <w:t xml:space="preserve">/, </w:t>
-            </w:r>
-            <w:proofErr w:type="spellStart"/>
-            <w:r>
-              <w:rPr>
-                <w:color w:val="3D2817"/>
-              </w:rPr>
-              <w:t>img</w:t>
-            </w:r>
-            <w:proofErr w:type="spellEnd"/>
-            <w:r>
-              <w:rPr>
-                <w:color w:val="3D2817"/>
-              </w:rPr>
-              <w:t xml:space="preserve">/, </w:t>
-            </w:r>
-            <w:proofErr w:type="spellStart"/>
-            <w:r>
-              <w:rPr>
-                <w:color w:val="3D2817"/>
-              </w:rPr>
-              <w:t>media</w:t>
-            </w:r>
-            <w:proofErr w:type="spellEnd"/>
-            <w:r>
-              <w:rPr>
-                <w:color w:val="3D2817"/>
-              </w:rPr>
-              <w:t>/</w:t>
-            </w:r>
-            <w:proofErr w:type="spellStart"/>
-            <w:r>
-              <w:rPr>
-                <w:color w:val="3D2817"/>
-              </w:rPr>
-              <w:t>video</w:t>
-            </w:r>
-            <w:proofErr w:type="spellEnd"/>
-            <w:r>
-              <w:rPr>
-                <w:color w:val="3D2817"/>
-              </w:rPr>
-              <w:t xml:space="preserve">/, </w:t>
-            </w:r>
-            <w:proofErr w:type="spellStart"/>
-            <w:r>
-              <w:rPr>
-                <w:color w:val="3D2817"/>
-              </w:rPr>
-              <w:t>media</w:t>
-            </w:r>
-            <w:proofErr w:type="spellEnd"/>
-            <w:r>
-              <w:rPr>
-                <w:color w:val="3D2817"/>
-              </w:rPr>
-              <w:t>/</w:t>
-            </w:r>
-            <w:proofErr w:type="spellStart"/>
-            <w:r>
-              <w:rPr>
-                <w:color w:val="3D2817"/>
-              </w:rPr>
-              <w:t>audio</w:t>
-            </w:r>
-            <w:proofErr w:type="spellEnd"/>
-            <w:r>
-              <w:rPr>
-                <w:color w:val="3D2817"/>
-              </w:rPr>
-              <w:t xml:space="preserve">/. </w:t>
+              <w:t xml:space="preserve">Ordnerstruktur: css/, html/, img/, media/video/, media/audio/. </w:t>
             </w:r>
             <w:r>
               <w:rPr>
@@ -2141,7 +1795,13 @@
               <w:rPr>
                 <w:color w:val="3D2817"/>
               </w:rPr>
-              <w:t>Favicon: noch zu ergänzen</w:t>
+              <w:t>Favicon:</w:t>
+            </w:r>
+            <w:r>
+              <w:rPr>
+                <w:color w:val="3D2817"/>
+              </w:rPr>
+              <w:t xml:space="preserve"> Auf jeder Seite im Head zu finden.</w:t>
             </w:r>
           </w:p>
         </w:tc>
@@ -2157,7 +1817,27 @@
           <w:color w:val="B85C38"/>
         </w:rPr>
       </w:pPr>
-      <w:bookmarkStart w:id="2" w:name="_Toc229497088"/>
+      <w:bookmarkStart w:id="2" w:name="_Toc230703502"/>
+    </w:p>
+    <w:p>
+      <w:pPr>
+        <w:pStyle w:val="berschrift2"/>
+        <w:jc w:val="both"/>
+        <w:rPr>
+          <w:rFonts w:ascii="Aptos Display" w:hAnsi="Aptos Display"/>
+          <w:color w:val="B85C38"/>
+        </w:rPr>
+      </w:pPr>
+    </w:p>
+    <w:p>
+      <w:pPr>
+        <w:pStyle w:val="berschrift2"/>
+        <w:jc w:val="both"/>
+        <w:rPr>
+          <w:rFonts w:ascii="Aptos Display" w:hAnsi="Aptos Display"/>
+          <w:color w:val="B85C38"/>
+        </w:rPr>
+      </w:pPr>
       <w:r>
         <w:rPr>
           <w:rFonts w:ascii="Aptos Display" w:hAnsi="Aptos Display"/>
@@ -2180,207 +1860,7 @@
           <w:rFonts w:ascii="Aptos" w:hAnsi="Aptos"/>
           <w:color w:val="000000"/>
         </w:rPr>
-        <w:t>Wichtig wäre, die Ordnerstruktur (</w:t>
-      </w:r>
-      <w:proofErr w:type="spellStart"/>
-      <w:r>
-        <w:rPr>
-          <w:rFonts w:ascii="Aptos" w:hAnsi="Aptos"/>
-          <w:color w:val="000000"/>
-        </w:rPr>
-        <w:t>css</w:t>
-      </w:r>
-      <w:proofErr w:type="spellEnd"/>
-      <w:r>
-        <w:rPr>
-          <w:rFonts w:ascii="Aptos" w:hAnsi="Aptos"/>
-          <w:color w:val="000000"/>
-        </w:rPr>
-        <w:t xml:space="preserve">/, </w:t>
-      </w:r>
-      <w:proofErr w:type="spellStart"/>
-      <w:r>
-        <w:rPr>
-          <w:rFonts w:ascii="Aptos" w:hAnsi="Aptos"/>
-          <w:color w:val="000000"/>
-        </w:rPr>
-        <w:t>html</w:t>
-      </w:r>
-      <w:proofErr w:type="spellEnd"/>
-      <w:r>
-        <w:rPr>
-          <w:rFonts w:ascii="Aptos" w:hAnsi="Aptos"/>
-          <w:color w:val="000000"/>
-        </w:rPr>
-        <w:t xml:space="preserve">/, </w:t>
-      </w:r>
-      <w:proofErr w:type="spellStart"/>
-      <w:r>
-        <w:rPr>
-          <w:rFonts w:ascii="Aptos" w:hAnsi="Aptos"/>
-          <w:color w:val="000000"/>
-        </w:rPr>
-        <w:t>img</w:t>
-      </w:r>
-      <w:proofErr w:type="spellEnd"/>
-      <w:r>
-        <w:rPr>
-          <w:rFonts w:ascii="Aptos" w:hAnsi="Aptos"/>
-          <w:color w:val="000000"/>
-        </w:rPr>
-        <w:t xml:space="preserve">/, </w:t>
-      </w:r>
-      <w:proofErr w:type="spellStart"/>
-      <w:r>
-        <w:rPr>
-          <w:rFonts w:ascii="Aptos" w:hAnsi="Aptos"/>
-          <w:color w:val="000000"/>
-        </w:rPr>
-        <w:t>media</w:t>
-      </w:r>
-      <w:proofErr w:type="spellEnd"/>
-      <w:r>
-        <w:rPr>
-          <w:rFonts w:ascii="Aptos" w:hAnsi="Aptos"/>
-          <w:color w:val="000000"/>
-        </w:rPr>
-        <w:t>/) beizubehalten und neue Inhalte in die bestehenden semantischen Bereiche (</w:t>
-      </w:r>
-      <w:proofErr w:type="spellStart"/>
-      <w:r>
-        <w:rPr>
-          <w:rFonts w:ascii="Aptos" w:hAnsi="Aptos"/>
-          <w:color w:val="000000"/>
-        </w:rPr>
-        <w:t>header</w:t>
-      </w:r>
-      <w:proofErr w:type="spellEnd"/>
-      <w:r>
-        <w:rPr>
-          <w:rFonts w:ascii="Aptos" w:hAnsi="Aptos"/>
-          <w:color w:val="000000"/>
-        </w:rPr>
-        <w:t xml:space="preserve">, </w:t>
-      </w:r>
-      <w:proofErr w:type="spellStart"/>
-      <w:r>
-        <w:rPr>
-          <w:rFonts w:ascii="Aptos" w:hAnsi="Aptos"/>
-          <w:color w:val="000000"/>
-        </w:rPr>
-        <w:t>nav</w:t>
-      </w:r>
-      <w:proofErr w:type="spellEnd"/>
-      <w:r>
-        <w:rPr>
-          <w:rFonts w:ascii="Aptos" w:hAnsi="Aptos"/>
-          <w:color w:val="000000"/>
-        </w:rPr>
-        <w:t xml:space="preserve">, </w:t>
-      </w:r>
-      <w:proofErr w:type="spellStart"/>
-      <w:r>
-        <w:rPr>
-          <w:rFonts w:ascii="Aptos" w:hAnsi="Aptos"/>
-          <w:color w:val="000000"/>
-        </w:rPr>
-        <w:t>main</w:t>
-      </w:r>
-      <w:proofErr w:type="spellEnd"/>
-      <w:r>
-        <w:rPr>
-          <w:rFonts w:ascii="Aptos" w:hAnsi="Aptos"/>
-          <w:color w:val="000000"/>
-        </w:rPr>
-        <w:t xml:space="preserve">, </w:t>
-      </w:r>
-      <w:proofErr w:type="spellStart"/>
-      <w:r>
-        <w:rPr>
-          <w:rFonts w:ascii="Aptos" w:hAnsi="Aptos"/>
-          <w:color w:val="000000"/>
-        </w:rPr>
-        <w:t>section</w:t>
-      </w:r>
-      <w:proofErr w:type="spellEnd"/>
-      <w:r>
-        <w:rPr>
-          <w:rFonts w:ascii="Aptos" w:hAnsi="Aptos"/>
-          <w:color w:val="000000"/>
-        </w:rPr>
-        <w:t xml:space="preserve">, </w:t>
-      </w:r>
-      <w:proofErr w:type="spellStart"/>
-      <w:r>
-        <w:rPr>
-          <w:rFonts w:ascii="Aptos" w:hAnsi="Aptos"/>
-          <w:color w:val="000000"/>
-        </w:rPr>
-        <w:t>footer</w:t>
-      </w:r>
-      <w:proofErr w:type="spellEnd"/>
-      <w:r>
-        <w:rPr>
-          <w:rFonts w:ascii="Aptos" w:hAnsi="Aptos"/>
-          <w:color w:val="000000"/>
-        </w:rPr>
-        <w:t xml:space="preserve">) einzubauen. Das eigene Stylesheet </w:t>
-      </w:r>
-      <w:proofErr w:type="spellStart"/>
-      <w:r>
-        <w:rPr>
-          <w:rFonts w:ascii="Aptos" w:hAnsi="Aptos"/>
-          <w:color w:val="000000"/>
-        </w:rPr>
-        <w:t>css</w:t>
-      </w:r>
-      <w:proofErr w:type="spellEnd"/>
-      <w:r>
-        <w:rPr>
-          <w:rFonts w:ascii="Aptos" w:hAnsi="Aptos"/>
-          <w:color w:val="000000"/>
-        </w:rPr>
-        <w:t xml:space="preserve">/style.css enthält oben </w:t>
-      </w:r>
-      <w:proofErr w:type="gramStart"/>
-      <w:r>
-        <w:rPr>
-          <w:rFonts w:ascii="Aptos" w:hAnsi="Aptos"/>
-          <w:color w:val="000000"/>
-        </w:rPr>
-        <w:t>in :root</w:t>
-      </w:r>
-      <w:proofErr w:type="gramEnd"/>
-      <w:r>
-        <w:rPr>
-          <w:rFonts w:ascii="Aptos" w:hAnsi="Aptos"/>
-          <w:color w:val="000000"/>
-        </w:rPr>
-        <w:t xml:space="preserve"> die zentralen Variablen für Schriftart, Farben und Hintergrund — wer das Design ändern will, sollte </w:t>
-      </w:r>
-      <w:r>
-        <w:rPr>
-          <w:rFonts w:ascii="Aptos" w:hAnsi="Aptos"/>
-          <w:color w:val="000000"/>
-        </w:rPr>
-        <w:lastRenderedPageBreak/>
-        <w:t xml:space="preserve">zuerst dort ansetzen, damit alle Seiten konsistent bleiben. Die Navigation und der </w:t>
-      </w:r>
-      <w:proofErr w:type="spellStart"/>
-      <w:r>
-        <w:rPr>
-          <w:rFonts w:ascii="Aptos" w:hAnsi="Aptos"/>
-          <w:color w:val="000000"/>
-        </w:rPr>
-        <w:t>Footer</w:t>
-      </w:r>
-      <w:proofErr w:type="spellEnd"/>
-      <w:r>
-        <w:rPr>
-          <w:rFonts w:ascii="Aptos" w:hAnsi="Aptos"/>
-          <w:color w:val="000000"/>
-        </w:rPr>
-        <w:t xml:space="preserve"> sind auf allen vier Seiten identisch und müssen bei Änderungen überall mitgepflegt werden. Das Modal-Fenster ist im CSS schon vorbereitet, im HTML aber noch nicht eingebaut — das wäre der nächste logische Schritt. Auch Favicon, Abgabedatum und Dateiname der Dokumentation auf der Startseite fehlen noch und sollten ergänzt werden.</w:t>
+        <w:t>Wichtig wäre, die Ordnerstruktur (css/, html/, img/, media/) beizubehalten und neue Inhalte in die bestehenden semantischen Bereiche (header, nav, main, section, footer) einzubauen. Das eigene Stylesheet css/style.css enthält oben in :root die zentralen Variablen für Schriftart, Farben und Hintergrund — wer das Design ändern will, sollte zuerst dort ansetzen, damit alle Seiten konsistent bleiben. Die Navigation und der Footer sind auf allen vier Seiten identisch und müssen bei Änderungen überall mitgepflegt werden. Das Modal-Fenster ist im CSS schon vorbereitet, im HTML aber noch nicht eingebaut — das wäre der nächste logische Schritt. Auch Favicon, Abgabedatum und Dateiname der Dokumentation auf der Startseite fehlen noch und sollten ergänzt werden.</w:t>
       </w:r>
     </w:p>
     <w:p>
@@ -2392,7 +1872,7 @@
           <w:color w:val="B85C38"/>
         </w:rPr>
       </w:pPr>
-      <w:bookmarkStart w:id="3" w:name="_Toc229497089"/>
+      <w:bookmarkStart w:id="3" w:name="_Toc230703503"/>
       <w:r>
         <w:rPr>
           <w:rFonts w:ascii="Aptos Display" w:hAnsi="Aptos Display"/>
@@ -2415,23 +1895,7 @@
           <w:rFonts w:ascii="Aptos" w:hAnsi="Aptos"/>
           <w:color w:val="000000"/>
         </w:rPr>
-        <w:t xml:space="preserve">Mit mehr Zeit würden wir verschiedene zusätzliche Animationen ausprobieren — zum Beispiel sanfte Übergänge beim Seitenwechsel, animierte Hover-Effekte auf den Cards und kleine Bewegungen, die das Auge führen. Ausserdem würden wir unser Logo besser einsetzen: prominenter in der </w:t>
-      </w:r>
-      <w:proofErr w:type="gramStart"/>
-      <w:r>
-        <w:rPr>
-          <w:rFonts w:ascii="Aptos" w:hAnsi="Aptos"/>
-          <w:color w:val="000000"/>
-        </w:rPr>
-        <w:t>Navigation,</w:t>
-      </w:r>
-      <w:proofErr w:type="gramEnd"/>
-      <w:r>
-        <w:rPr>
-          <w:rFonts w:ascii="Aptos" w:hAnsi="Aptos"/>
-          <w:color w:val="000000"/>
-        </w:rPr>
-        <w:t xml:space="preserve"> als Favicon im Browser-Tab und als wiederkehrendes Element auf allen Seiten, damit der Wiedererkennungswert steigt.</w:t>
+        <w:t>Mit mehr Zeit würden wir verschiedene zusätzliche Animationen ausprobieren — zum Beispiel sanfte Übergänge beim Seitenwechsel, animierte Hover-Effekte auf den Cards und kleine Bewegungen, die das Auge führen. Ausserdem würden wir unser Logo besser einsetzen: prominenter in der Navigation, als Favicon im Browser-Tab und als wiederkehrendes Element auf allen Seiten, damit der Wiedererkennungswert steigt.</w:t>
       </w:r>
     </w:p>
     <w:p>
@@ -2454,31 +1918,15 @@
           <w:color w:val="B85C38"/>
         </w:rPr>
       </w:pPr>
-      <w:bookmarkStart w:id="4" w:name="_Toc229497090"/>
-      <w:proofErr w:type="spellStart"/>
+      <w:bookmarkStart w:id="4" w:name="_Toc230703504"/>
       <w:r>
         <w:rPr>
           <w:color w:val="B85C38"/>
         </w:rPr>
         <w:lastRenderedPageBreak/>
-        <w:t>Lessons</w:t>
-      </w:r>
-      <w:proofErr w:type="spellEnd"/>
-      <w:r>
-        <w:rPr>
-          <w:color w:val="B85C38"/>
-        </w:rPr>
-        <w:t xml:space="preserve"> </w:t>
-      </w:r>
-      <w:proofErr w:type="spellStart"/>
-      <w:r>
-        <w:rPr>
-          <w:color w:val="B85C38"/>
-        </w:rPr>
-        <w:t>Learned</w:t>
+        <w:t>Lessons Learned</w:t>
       </w:r>
       <w:bookmarkEnd w:id="4"/>
-      <w:proofErr w:type="spellEnd"/>
     </w:p>
     <w:p/>
     <w:p>
@@ -2506,49 +1954,7 @@
         <w:rPr>
           <w:rFonts w:ascii="Aptos" w:hAnsi="Aptos"/>
         </w:rPr>
-        <w:t>Auch das Platzieren der Inhalte war anspruchsvoller als erwartet. Wir mussten ein Gefühl dafür bekommen, wie viel Text und wie viele Bilder pro Abschnitt sinnvoll sind, damit die Seite nicht überladen wirkt. CSS-</w:t>
-      </w:r>
-      <w:proofErr w:type="spellStart"/>
-      <w:r>
-        <w:rPr>
-          <w:rFonts w:ascii="Aptos" w:hAnsi="Aptos"/>
-        </w:rPr>
-        <w:t>Grid</w:t>
-      </w:r>
-      <w:proofErr w:type="spellEnd"/>
-      <w:r>
-        <w:rPr>
-          <w:rFonts w:ascii="Aptos" w:hAnsi="Aptos"/>
-        </w:rPr>
-        <w:t xml:space="preserve"> und </w:t>
-      </w:r>
-      <w:proofErr w:type="spellStart"/>
-      <w:r>
-        <w:rPr>
-          <w:rFonts w:ascii="Aptos" w:hAnsi="Aptos"/>
-        </w:rPr>
-        <w:t>Flexbox</w:t>
-      </w:r>
-      <w:proofErr w:type="spellEnd"/>
-      <w:r>
-        <w:rPr>
-          <w:rFonts w:ascii="Aptos" w:hAnsi="Aptos"/>
-        </w:rPr>
-        <w:t xml:space="preserve"> haben uns hier sehr geholfen — die Mehrspalten-Layouts (2, 3 und 4 Spalten) liessen sich damit viel sauberer umsetzen als mit klassischen </w:t>
-      </w:r>
-      <w:proofErr w:type="spellStart"/>
-      <w:r>
-        <w:rPr>
-          <w:rFonts w:ascii="Aptos" w:hAnsi="Aptos"/>
-        </w:rPr>
-        <w:t>Float</w:t>
-      </w:r>
-      <w:proofErr w:type="spellEnd"/>
-      <w:r>
-        <w:rPr>
-          <w:rFonts w:ascii="Aptos" w:hAnsi="Aptos"/>
-        </w:rPr>
-        <w:t>-Konstruktionen.</w:t>
+        <w:t>Auch das Platzieren der Inhalte war anspruchsvoller als erwartet. Wir mussten ein Gefühl dafür bekommen, wie viel Text und wie viele Bilder pro Abschnitt sinnvoll sind, damit die Seite nicht überladen wirkt. CSS-Grid und Flexbox haben uns hier sehr geholfen — die Mehrspalten-Layouts (2, 3 und 4 Spalten) liessen sich damit viel sauberer umsetzen als mit klassischen Float-Konstruktionen.</w:t>
       </w:r>
     </w:p>
     <w:p>
@@ -2562,21 +1968,7 @@
         <w:rPr>
           <w:rFonts w:ascii="Aptos" w:hAnsi="Aptos"/>
         </w:rPr>
-        <w:t xml:space="preserve">Methodisch haben wir gemerkt, wie wichtig eine klare Ordnerstruktur und konsistente Klassennamen sind. Am Anfang lagen Dateien noch wild verteilt, was schnell unübersichtlich wurde. Mit getrennten Ordnern für CSS, HTML, Bilder und Medien sowie zentralen Variablen </w:t>
-      </w:r>
-      <w:proofErr w:type="gramStart"/>
-      <w:r>
-        <w:rPr>
-          <w:rFonts w:ascii="Aptos" w:hAnsi="Aptos"/>
-        </w:rPr>
-        <w:t>in :root</w:t>
-      </w:r>
-      <w:proofErr w:type="gramEnd"/>
-      <w:r>
-        <w:rPr>
-          <w:rFonts w:ascii="Aptos" w:hAnsi="Aptos"/>
-        </w:rPr>
-        <w:t xml:space="preserve"> liess sich das Projekt deutlich besser pflegen.</w:t>
+        <w:t>Methodisch haben wir gemerkt, wie wichtig eine klare Ordnerstruktur und konsistente Klassennamen sind. Am Anfang lagen Dateien noch wild verteilt, was schnell unübersichtlich wurde. Mit getrennten Ordnern für CSS, HTML, Bilder und Medien sowie zentralen Variablen in :root liess sich das Projekt deutlich besser pflegen.</w:t>
       </w:r>
     </w:p>
     <w:p>
@@ -2613,7 +2005,7 @@
           <w:color w:val="B85C38"/>
         </w:rPr>
       </w:pPr>
-      <w:bookmarkStart w:id="5" w:name="_Toc229497091"/>
+      <w:bookmarkStart w:id="5" w:name="_Toc230703505"/>
       <w:r>
         <w:rPr>
           <w:color w:val="B85C38"/>
@@ -2774,32 +2166,275 @@
     <w:pPr>
       <w:pStyle w:val="Fuzeile"/>
     </w:pPr>
+    <w:r>
+      <w:rPr>
+        <w:noProof/>
+      </w:rPr>
+      <mc:AlternateContent>
+        <mc:Choice Requires="wps">
+          <w:drawing>
+            <wp:anchor distT="0" distB="0" distL="0" distR="0" simplePos="0" relativeHeight="251659264" behindDoc="0" locked="0" layoutInCell="1" allowOverlap="1" wp14:anchorId="2247B34F" wp14:editId="25FB8D78">
+              <wp:simplePos x="635" y="635"/>
+              <wp:positionH relativeFrom="page">
+                <wp:align>left</wp:align>
+              </wp:positionH>
+              <wp:positionV relativeFrom="page">
+                <wp:align>bottom</wp:align>
+              </wp:positionV>
+              <wp:extent cx="789940" cy="370205"/>
+              <wp:effectExtent l="0" t="0" r="10160" b="0"/>
+              <wp:wrapNone/>
+              <wp:docPr id="301513253" name="Textfeld 3" descr="Protected">
+                <a:extLst xmlns:a="http://schemas.openxmlformats.org/drawingml/2006/main">
+                  <a:ext uri="{5AE41FA2-C0FF-4470-9BD4-5FADCA87CBE2}">
+                    <aclsh:classification xmlns:aclsh="http://schemas.microsoft.com/office/drawing/2020/classificationShape" classificationOutcomeType="ftr"/>
+                  </a:ext>
+                </a:extLst>
+              </wp:docPr>
+              <wp:cNvGraphicFramePr/>
+              <a:graphic xmlns:a="http://schemas.openxmlformats.org/drawingml/2006/main">
+                <a:graphicData uri="http://schemas.microsoft.com/office/word/2010/wordprocessingShape">
+                  <wps:wsp>
+                    <wps:cNvSpPr txBox="1"/>
+                    <wps:spPr>
+                      <a:xfrm>
+                        <a:off x="0" y="0"/>
+                        <a:ext cx="789940" cy="370205"/>
+                      </a:xfrm>
+                      <a:prstGeom prst="rect">
+                        <a:avLst/>
+                      </a:prstGeom>
+                      <a:noFill/>
+                      <a:ln>
+                        <a:noFill/>
+                      </a:ln>
+                    </wps:spPr>
+                    <wps:txbx>
+                      <w:txbxContent>
+                        <w:p>
+                          <w:pPr>
+                            <w:spacing w:after="0"/>
+                            <w:rPr>
+                              <w:rFonts w:ascii="Aptos" w:eastAsia="Aptos" w:hAnsi="Aptos" w:cs="Aptos"/>
+                              <w:noProof/>
+                              <w:color w:val="000000"/>
+                              <w:sz w:val="20"/>
+                              <w:szCs w:val="20"/>
+                            </w:rPr>
+                          </w:pPr>
+                          <w:r>
+                            <w:rPr>
+                              <w:rFonts w:ascii="Aptos" w:eastAsia="Aptos" w:hAnsi="Aptos" w:cs="Aptos"/>
+                              <w:noProof/>
+                              <w:color w:val="000000"/>
+                              <w:sz w:val="20"/>
+                              <w:szCs w:val="20"/>
+                            </w:rPr>
+                            <w:t>Protected</w:t>
+                          </w:r>
+                        </w:p>
+                      </w:txbxContent>
+                    </wps:txbx>
+                    <wps:bodyPr rot="0" spcFirstLastPara="0" vertOverflow="overflow" horzOverflow="overflow" vert="horz" wrap="none" lIns="254000" tIns="0" rIns="0" bIns="190500" numCol="1" spcCol="0" rtlCol="0" fromWordArt="0" anchor="b" anchorCtr="0" forceAA="0" compatLnSpc="1">
+                      <a:prstTxWarp prst="textNoShape">
+                        <a:avLst/>
+                      </a:prstTxWarp>
+                      <a:spAutoFit/>
+                    </wps:bodyPr>
+                  </wps:wsp>
+                </a:graphicData>
+              </a:graphic>
+            </wp:anchor>
+          </w:drawing>
+        </mc:Choice>
+        <mc:Fallback>
+          <w:pict>
+            <v:shapetype w14:anchorId="2247B34F" id="_x0000_t202" coordsize="21600,21600" o:spt="202" path="m,l,21600r21600,l21600,xe">
+              <v:stroke joinstyle="miter"/>
+              <v:path gradientshapeok="t" o:connecttype="rect"/>
+            </v:shapetype>
+            <v:shape id="Textfeld 3" o:spid="_x0000_s1026" type="#_x0000_t202" alt="Protected" style="position:absolute;margin-left:0;margin-top:0;width:62.2pt;height:29.15pt;z-index:251659264;visibility:visible;mso-wrap-style:none;mso-wrap-distance-left:0;mso-wrap-distance-top:0;mso-wrap-distance-right:0;mso-wrap-distance-bottom:0;mso-position-horizontal:left;mso-position-horizontal-relative:page;mso-position-vertical:bottom;mso-position-vertical-relative:page;v-text-anchor:bottom" o:gfxdata="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" filled="f" stroked="f">
+              <v:fill o:detectmouseclick="t"/>
+              <v:textbox style="mso-fit-shape-to-text:t" inset="20pt,0,0,15pt">
+                <w:txbxContent>
+                  <w:p>
+                    <w:pPr>
+                      <w:spacing w:after="0"/>
+                      <w:rPr>
+                        <w:rFonts w:ascii="Aptos" w:eastAsia="Aptos" w:hAnsi="Aptos" w:cs="Aptos"/>
+                        <w:noProof/>
+                        <w:color w:val="000000"/>
+                        <w:sz w:val="20"/>
+                        <w:szCs w:val="20"/>
+                      </w:rPr>
+                    </w:pPr>
+                    <w:r>
+                      <w:rPr>
+                        <w:rFonts w:ascii="Aptos" w:eastAsia="Aptos" w:hAnsi="Aptos" w:cs="Aptos"/>
+                        <w:noProof/>
+                        <w:color w:val="000000"/>
+                        <w:sz w:val="20"/>
+                        <w:szCs w:val="20"/>
+                      </w:rPr>
+                      <w:t>Protected</w:t>
+                    </w:r>
+                  </w:p>
+                </w:txbxContent>
+              </v:textbox>
+              <w10:wrap anchorx="page" anchory="page"/>
+            </v:shape>
+          </w:pict>
+        </mc:Fallback>
+      </mc:AlternateContent>
+    </w:r>
   </w:p>
 </w:ftr>
 </file>
 
 <file path=word/footer2.xml><?xml version="1.0" encoding="utf-8"?>
 <w:ftr xmlns:wpc="http://schemas.microsoft.com/office/word/2010/wordprocessingCanvas" xmlns:cx="http://schemas.microsoft.com/office/drawing/2014/chartex" xmlns:cx1="http://schemas.microsoft.com/office/drawing/2015/9/8/chartex" xmlns:cx2="http://schemas.microsoft.com/office/drawing/2015/10/21/chartex" xmlns:cx3="http://schemas.microsoft.com/office/drawing/2016/5/9/chartex" xmlns:cx4="http://schemas.microsoft.com/office/drawing/2016/5/10/chartex" xmlns:cx5="http://schemas.microsoft.com/office/drawing/2016/5/11/chartex" xmlns:cx6="http://schemas.microsoft.com/office/drawing/2016/5/12/chartex" xmlns:cx7="http://schemas.microsoft.com/office/drawing/2016/5/13/chartex" xmlns:cx8="http://schemas.microsoft.com/office/drawing/2016/5/14/chartex" xmlns:mc="http://schemas.openxmlformats.org/markup-compatibility/2006" xmlns:aink="http://schemas.microsoft.com/office/drawing/2016/ink" xmlns:am3d="http://schemas.microsoft.com/office/drawing/2017/model3d" xmlns:o="urn:schemas-microsoft-com:office:office" xmlns:oel="http://schemas.microsoft.com/office/2019/extlst" xmlns:r="http://schemas.openxmlformats.org/officeDocument/2006/relationships" xmlns:m="http://schemas.openxmlformats.org/officeDocument/2006/math" xmlns:v="urn:schemas-microsoft-com:vml" xmlns:wp14="http://schemas.microsoft.com/office/word/2010/wordprocessingDrawing" xmlns:wp="http://schemas.openxmlformats.org/drawingml/2006/wordprocessingDrawing" xmlns:w10="urn:schemas-microsoft-com:office:word" xmlns:w="http://schemas.openxmlformats.org/wordprocessingml/2006/main" xmlns:w14="http://schemas.microsoft.com/office/word/2010/wordml" xmlns:w15="http://schemas.microsoft.com/office/word/2012/wordml" xmlns:w16cex="http://schemas.microsoft.com/office/word/2018/wordml/cex" xmlns:w16cid="http://schemas.microsoft.com/office/word/2016/wordml/cid" xmlns:w16="http://schemas.microsoft.com/office/word/2018/wordml" xmlns:w16du="http://schemas.microsoft.com/office/word/2023/wordml/word16du" xmlns:w16sdtdh="http://schemas.microsoft.com/office/word/2020/wordml/sdtdatahash" xmlns:w16sdtfl="http://schemas.microsoft.com/office/word/2024/wordml/sdtformatlock" xmlns:w16se="http://schemas.microsoft.com/office/word/2015/wordml/symex" xmlns:wpg="http://schemas.microsoft.com/office/word/2010/wordprocessingGroup" xmlns:wpi="http://schemas.microsoft.com/office/word/2010/wordprocessingInk" xmlns:wne="http://schemas.microsoft.com/office/word/2006/wordml" xmlns:wps="http://schemas.microsoft.com/office/word/2010/wordprocessingShape" mc:Ignorable="w14 w15 w16se w16cid w16 w16cex w16sdtdh w16sdtfl w16du wp14">
-  <w:sdt>
-    <w:sdtPr>
+  <w:p>
+    <w:pPr>
+      <w:pStyle w:val="Fuzeile"/>
+      <w:jc w:val="right"/>
       <w:rPr>
         <w:color w:val="3D2817"/>
       </w:rPr>
-      <w:id w:val="-1163309974"/>
-      <w:docPartObj>
-        <w:docPartGallery w:val="Page Numbers (Bottom of Page)"/>
-        <w:docPartUnique/>
-      </w:docPartObj>
-    </w:sdtPr>
-    <w:sdtContent>
-      <w:p>
-        <w:pPr>
-          <w:pStyle w:val="Fuzeile"/>
-          <w:jc w:val="right"/>
-          <w:rPr>
-            <w:color w:val="3D2817"/>
-          </w:rPr>
-        </w:pPr>
+    </w:pPr>
+    <w:r>
+      <w:rPr>
+        <w:noProof/>
+        <w:color w:val="3D2817"/>
+      </w:rPr>
+      <mc:AlternateContent>
+        <mc:Choice Requires="wps">
+          <w:drawing>
+            <wp:anchor distT="0" distB="0" distL="0" distR="0" simplePos="0" relativeHeight="251660288" behindDoc="0" locked="0" layoutInCell="1" allowOverlap="1" wp14:anchorId="07AB801B" wp14:editId="0513A9A4">
+              <wp:simplePos x="635" y="635"/>
+              <wp:positionH relativeFrom="page">
+                <wp:align>left</wp:align>
+              </wp:positionH>
+              <wp:positionV relativeFrom="page">
+                <wp:align>bottom</wp:align>
+              </wp:positionV>
+              <wp:extent cx="789940" cy="370205"/>
+              <wp:effectExtent l="0" t="0" r="10160" b="0"/>
+              <wp:wrapNone/>
+              <wp:docPr id="81376246" name="Textfeld 4" descr="Protected">
+                <a:extLst xmlns:a="http://schemas.openxmlformats.org/drawingml/2006/main">
+                  <a:ext uri="{5AE41FA2-C0FF-4470-9BD4-5FADCA87CBE2}">
+                    <aclsh:classification xmlns:aclsh="http://schemas.microsoft.com/office/drawing/2020/classificationShape" classificationOutcomeType="ftr"/>
+                  </a:ext>
+                </a:extLst>
+              </wp:docPr>
+              <wp:cNvGraphicFramePr/>
+              <a:graphic xmlns:a="http://schemas.openxmlformats.org/drawingml/2006/main">
+                <a:graphicData uri="http://schemas.microsoft.com/office/word/2010/wordprocessingShape">
+                  <wps:wsp>
+                    <wps:cNvSpPr txBox="1"/>
+                    <wps:spPr>
+                      <a:xfrm>
+                        <a:off x="0" y="0"/>
+                        <a:ext cx="789940" cy="370205"/>
+                      </a:xfrm>
+                      <a:prstGeom prst="rect">
+                        <a:avLst/>
+                      </a:prstGeom>
+                      <a:noFill/>
+                      <a:ln>
+                        <a:noFill/>
+                      </a:ln>
+                    </wps:spPr>
+                    <wps:txbx>
+                      <w:txbxContent>
+                        <w:p>
+                          <w:pPr>
+                            <w:spacing w:after="0"/>
+                            <w:rPr>
+                              <w:rFonts w:ascii="Aptos" w:eastAsia="Aptos" w:hAnsi="Aptos" w:cs="Aptos"/>
+                              <w:noProof/>
+                              <w:color w:val="000000"/>
+                              <w:sz w:val="20"/>
+                              <w:szCs w:val="20"/>
+                            </w:rPr>
+                          </w:pPr>
+                          <w:r>
+                            <w:rPr>
+                              <w:rFonts w:ascii="Aptos" w:eastAsia="Aptos" w:hAnsi="Aptos" w:cs="Aptos"/>
+                              <w:noProof/>
+                              <w:color w:val="000000"/>
+                              <w:sz w:val="20"/>
+                              <w:szCs w:val="20"/>
+                            </w:rPr>
+                            <w:t>Protected</w:t>
+                          </w:r>
+                        </w:p>
+                      </w:txbxContent>
+                    </wps:txbx>
+                    <wps:bodyPr rot="0" spcFirstLastPara="0" vertOverflow="overflow" horzOverflow="overflow" vert="horz" wrap="none" lIns="254000" tIns="0" rIns="0" bIns="190500" numCol="1" spcCol="0" rtlCol="0" fromWordArt="0" anchor="b" anchorCtr="0" forceAA="0" compatLnSpc="1">
+                      <a:prstTxWarp prst="textNoShape">
+                        <a:avLst/>
+                      </a:prstTxWarp>
+                      <a:spAutoFit/>
+                    </wps:bodyPr>
+                  </wps:wsp>
+                </a:graphicData>
+              </a:graphic>
+            </wp:anchor>
+          </w:drawing>
+        </mc:Choice>
+        <mc:Fallback>
+          <w:pict>
+            <v:shapetype w14:anchorId="07AB801B" id="_x0000_t202" coordsize="21600,21600" o:spt="202" path="m,l,21600r21600,l21600,xe">
+              <v:stroke joinstyle="miter"/>
+              <v:path gradientshapeok="t" o:connecttype="rect"/>
+            </v:shapetype>
+            <v:shape id="Textfeld 4" o:spid="_x0000_s1027" type="#_x0000_t202" alt="Protected" style="position:absolute;left:0;text-align:left;margin-left:0;margin-top:0;width:62.2pt;height:29.15pt;z-index:251660288;visibility:visible;mso-wrap-style:none;mso-wrap-distance-left:0;mso-wrap-distance-top:0;mso-wrap-distance-right:0;mso-wrap-distance-bottom:0;mso-position-horizontal:left;mso-position-horizontal-relative:page;mso-position-vertical:bottom;mso-position-vertical-relative:page;v-text-anchor:bottom" o:gfxdata="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" filled="f" stroked="f">
+              <v:fill o:detectmouseclick="t"/>
+              <v:textbox style="mso-fit-shape-to-text:t" inset="20pt,0,0,15pt">
+                <w:txbxContent>
+                  <w:p>
+                    <w:pPr>
+                      <w:spacing w:after="0"/>
+                      <w:rPr>
+                        <w:rFonts w:ascii="Aptos" w:eastAsia="Aptos" w:hAnsi="Aptos" w:cs="Aptos"/>
+                        <w:noProof/>
+                        <w:color w:val="000000"/>
+                        <w:sz w:val="20"/>
+                        <w:szCs w:val="20"/>
+                      </w:rPr>
+                    </w:pPr>
+                    <w:r>
+                      <w:rPr>
+                        <w:rFonts w:ascii="Aptos" w:eastAsia="Aptos" w:hAnsi="Aptos" w:cs="Aptos"/>
+                        <w:noProof/>
+                        <w:color w:val="000000"/>
+                        <w:sz w:val="20"/>
+                        <w:szCs w:val="20"/>
+                      </w:rPr>
+                      <w:t>Protected</w:t>
+                    </w:r>
+                  </w:p>
+                </w:txbxContent>
+              </v:textbox>
+              <w10:wrap anchorx="page" anchory="page"/>
+            </v:shape>
+          </w:pict>
+        </mc:Fallback>
+      </mc:AlternateContent>
+    </w:r>
+    <w:sdt>
+      <w:sdtPr>
+        <w:rPr>
+          <w:color w:val="3D2817"/>
+        </w:rPr>
+        <w:id w:val="-1163309974"/>
+        <w:docPartObj>
+          <w:docPartGallery w:val="Page Numbers (Bottom of Page)"/>
+          <w:docPartUnique/>
+        </w:docPartObj>
+      </w:sdtPr>
+      <w:sdtContent>
         <w:r>
           <w:rPr>
             <w:color w:val="3D2817"/>
@@ -2831,9 +2466,9 @@
           </w:rPr>
           <w:fldChar w:fldCharType="end"/>
         </w:r>
-      </w:p>
-    </w:sdtContent>
-  </w:sdt>
+      </w:sdtContent>
+    </w:sdt>
+  </w:p>
   <w:p>
     <w:pPr>
       <w:pStyle w:val="Fuzeile"/>
@@ -2851,6 +2486,127 @@
     <w:pPr>
       <w:pStyle w:val="Fuzeile"/>
     </w:pPr>
+    <w:r>
+      <w:rPr>
+        <w:noProof/>
+      </w:rPr>
+      <mc:AlternateContent>
+        <mc:Choice Requires="wps">
+          <w:drawing>
+            <wp:anchor distT="0" distB="0" distL="0" distR="0" simplePos="0" relativeHeight="251658240" behindDoc="0" locked="0" layoutInCell="1" allowOverlap="1" wp14:anchorId="4DAFB9F9" wp14:editId="2E8D0AFC">
+              <wp:simplePos x="635" y="635"/>
+              <wp:positionH relativeFrom="page">
+                <wp:align>left</wp:align>
+              </wp:positionH>
+              <wp:positionV relativeFrom="page">
+                <wp:align>bottom</wp:align>
+              </wp:positionV>
+              <wp:extent cx="789940" cy="370205"/>
+              <wp:effectExtent l="0" t="0" r="10160" b="0"/>
+              <wp:wrapNone/>
+              <wp:docPr id="1748526603" name="Textfeld 2" descr="Protected">
+                <a:extLst xmlns:a="http://schemas.openxmlformats.org/drawingml/2006/main">
+                  <a:ext uri="{5AE41FA2-C0FF-4470-9BD4-5FADCA87CBE2}">
+                    <aclsh:classification xmlns:aclsh="http://schemas.microsoft.com/office/drawing/2020/classificationShape" classificationOutcomeType="ftr"/>
+                  </a:ext>
+                </a:extLst>
+              </wp:docPr>
+              <wp:cNvGraphicFramePr/>
+              <a:graphic xmlns:a="http://schemas.openxmlformats.org/drawingml/2006/main">
+                <a:graphicData uri="http://schemas.microsoft.com/office/word/2010/wordprocessingShape">
+                  <wps:wsp>
+                    <wps:cNvSpPr txBox="1"/>
+                    <wps:spPr>
+                      <a:xfrm>
+                        <a:off x="0" y="0"/>
+                        <a:ext cx="789940" cy="370205"/>
+                      </a:xfrm>
+                      <a:prstGeom prst="rect">
+                        <a:avLst/>
+                      </a:prstGeom>
+                      <a:noFill/>
+                      <a:ln>
+                        <a:noFill/>
+                      </a:ln>
+                    </wps:spPr>
+                    <wps:txbx>
+                      <w:txbxContent>
+                        <w:p>
+                          <w:pPr>
+                            <w:spacing w:after="0"/>
+                            <w:rPr>
+                              <w:rFonts w:ascii="Aptos" w:eastAsia="Aptos" w:hAnsi="Aptos" w:cs="Aptos"/>
+                              <w:noProof/>
+                              <w:color w:val="000000"/>
+                              <w:sz w:val="20"/>
+                              <w:szCs w:val="20"/>
+                            </w:rPr>
+                          </w:pPr>
+                          <w:r>
+                            <w:rPr>
+                              <w:rFonts w:ascii="Aptos" w:eastAsia="Aptos" w:hAnsi="Aptos" w:cs="Aptos"/>
+                              <w:noProof/>
+                              <w:color w:val="000000"/>
+                              <w:sz w:val="20"/>
+                              <w:szCs w:val="20"/>
+                            </w:rPr>
+                            <w:t>Protected</w:t>
+                          </w:r>
+                        </w:p>
+                      </w:txbxContent>
+                    </wps:txbx>
+                    <wps:bodyPr rot="0" spcFirstLastPara="0" vertOverflow="overflow" horzOverflow="overflow" vert="horz" wrap="none" lIns="254000" tIns="0" rIns="0" bIns="190500" numCol="1" spcCol="0" rtlCol="0" fromWordArt="0" anchor="b" anchorCtr="0" forceAA="0" compatLnSpc="1">
+                      <a:prstTxWarp prst="textNoShape">
+                        <a:avLst/>
+                      </a:prstTxWarp>
+                      <a:spAutoFit/>
+                    </wps:bodyPr>
+                  </wps:wsp>
+                </a:graphicData>
+              </a:graphic>
+            </wp:anchor>
+          </w:drawing>
+        </mc:Choice>
+        <mc:Fallback>
+          <w:pict>
+            <v:shapetype w14:anchorId="4DAFB9F9" id="_x0000_t202" coordsize="21600,21600" o:spt="202" path="m,l,21600r21600,l21600,xe">
+              <v:stroke joinstyle="miter"/>
+              <v:path gradientshapeok="t" o:connecttype="rect"/>
+            </v:shapetype>
+            <v:shape id="Textfeld 2" o:spid="_x0000_s1028" type="#_x0000_t202" alt="Protected" style="position:absolute;margin-left:0;margin-top:0;width:62.2pt;height:29.15pt;z-index:251658240;visibility:visible;mso-wrap-style:none;mso-wrap-distance-left:0;mso-wrap-distance-top:0;mso-wrap-distance-right:0;mso-wrap-distance-bottom:0;mso-position-horizontal:left;mso-position-horizontal-relative:page;mso-position-vertical:bottom;mso-position-vertical-relative:page;v-text-anchor:bottom" o:gfxdata="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" filled="f" stroked="f">
+              <v:fill o:detectmouseclick="t"/>
+              <v:textbox style="mso-fit-shape-to-text:t" inset="20pt,0,0,15pt">
+                <w:txbxContent>
+                  <w:p>
+                    <w:pPr>
+                      <w:spacing w:after="0"/>
+                      <w:rPr>
+                        <w:rFonts w:ascii="Aptos" w:eastAsia="Aptos" w:hAnsi="Aptos" w:cs="Aptos"/>
+                        <w:noProof/>
+                        <w:color w:val="000000"/>
+                        <w:sz w:val="20"/>
+                        <w:szCs w:val="20"/>
+                      </w:rPr>
+                    </w:pPr>
+                    <w:r>
+                      <w:rPr>
+                        <w:rFonts w:ascii="Aptos" w:eastAsia="Aptos" w:hAnsi="Aptos" w:cs="Aptos"/>
+                        <w:noProof/>
+                        <w:color w:val="000000"/>
+                        <w:sz w:val="20"/>
+                        <w:szCs w:val="20"/>
+                      </w:rPr>
+                      <w:t>Protected</w:t>
+                    </w:r>
+                  </w:p>
+                </w:txbxContent>
+              </v:textbox>
+              <w10:wrap anchorx="page" anchory="page"/>
+            </v:shape>
+          </w:pict>
+        </mc:Fallback>
+      </mc:AlternateContent>
+    </w:r>
   </w:p>
 </w:ftr>
 </file>
@@ -5774,4 +5530,10 @@
     <ds:schemaRef ds:uri="http://schemas.openxmlformats.org/officeDocument/2006/bibliography"/>
   </ds:schemaRefs>
 </ds:datastoreItem>
+</file>
+
+<file path=docMetadata/LabelInfo.xml><?xml version="1.0" encoding="utf-8"?>
+<clbl:labelList xmlns:clbl="http://schemas.microsoft.com/office/2020/mipLabelMetadata">
+  <clbl:label id="{c9e95219-f5a7-44ac-939a-24b31c8acf7d}" enabled="1" method="Standard" siteId="{17e2513b-1cab-478e-87d0-48a47e65d3a1}" contentBits="2" removed="0"/>
+</clbl:labelList>
 </file>
</xml_diff>